<commit_message>
CS1105 Unit 7: strengthen discussion integration plan, cite Python docs for rounding
Co-Authored-By: Claude Opus 5.5 <noreply@anthropic.com>
</commit_message>
<xml_diff>
--- a/CS1105_Digital_Electronics_Architecture/Unit7_Assembler_Language/Discussion/Unit7_Discussion_Post.docx
+++ b/CS1105_Digital_Electronics_Architecture/Unit7_Assembler_Language/Discussion/Unit7_Discussion_Post.docx
@@ -148,7 +148,7 @@
           <w:i w:val="0"/>
           <w:sz w:val="24"/>
         </w:rPr>
-        <w:t>For this training project, imagine translating a small Python program that reads student marks, calculates averages and grade boundaries, and prints a report into an equivalent Java program. A tool that translates between two high-level languages is called a source-to-source compiler or transcompiler (Compiler, 2021). Doing the job by hand makes it clear that the hard part is keeping the meaning the same, not copying the syntax.</w:t>
+        <w:t>For this training project, imagine translating a small Python program that reads student marks, calculates averages and grades, and prints a report into an equivalent Java program. A tool that translates between two high-level languages is called a source-to-source compiler or transcompiler (Compiler, 2021). Doing the job by hand shows that the hard part is keeping the meaning the same, not copying the syntax.</w:t>
       </w:r>
     </w:p>
     <w:p>
@@ -177,7 +177,7 @@
           <w:i w:val="0"/>
           <w:sz w:val="24"/>
         </w:rPr>
-        <w:t>I would organize the work in five stages:</w:t>
+        <w:t>I would organize the work in six steps:</w:t>
       </w:r>
     </w:p>
     <w:p>
@@ -210,7 +210,7 @@
           <w:i w:val="0"/>
           <w:sz w:val="24"/>
         </w:rPr>
-        <w:t xml:space="preserve"> Before changing anything, run the Python program on many inputs, including edge cases, and save the outputs as "golden" test results. The Java version is finished only when it reproduces all of them.</w:t>
+        <w:t xml:space="preserve"> Run the Python program on many inputs, including edge cases, and save the outputs as "golden" test results. The Java version is finished only when it reproduces all of them.</w:t>
       </w:r>
     </w:p>
     <w:p>
@@ -234,7 +234,7 @@
           <w:i w:val="0"/>
           <w:sz w:val="24"/>
         </w:rPr>
-        <w:t>Map the structure.</w:t>
+        <w:t>Keep both versions in one repository.</w:t>
       </w:r>
       <w:r>
         <w:rPr>
@@ -243,7 +243,7 @@
           <w:i w:val="0"/>
           <w:sz w:val="24"/>
         </w:rPr>
-        <w:t xml:space="preserve"> Each Python module becomes a Java class in one package, functions become methods, lists become ArrayList, dictionaries become HashMap, and tuples become small records. Writing this mapping down first keeps the two code bases easy to compare.</w:t>
+        <w:t xml:space="preserve"> The Python code stays in a python folder, the Java code goes in a java folder, and the golden results sit in a shared tests folder, so both versions are checked against exactly the same data.</w:t>
       </w:r>
     </w:p>
     <w:p>
@@ -267,7 +267,7 @@
           <w:i w:val="0"/>
           <w:sz w:val="24"/>
         </w:rPr>
-        <w:t>Translate in phases, like a compiler.</w:t>
+        <w:t>Map the structure.</w:t>
       </w:r>
       <w:r>
         <w:rPr>
@@ -276,7 +276,7 @@
           <w:i w:val="0"/>
           <w:sz w:val="24"/>
         </w:rPr>
-        <w:t xml:space="preserve"> A compiler checks tokens, then grammar, then meaning (Bhumika, 2022; Neso Academy, 2022). I would do the same: first syntax (indentation becomes braces, def becomes typed method signatures), then a separate semantic pass that checks every type, division, and comparison.</w:t>
+        <w:t xml:space="preserve"> Each Python module becomes a Java class, functions become methods, lists become ArrayList, dictionaries become HashMap, and tuples become records.</w:t>
       </w:r>
     </w:p>
     <w:p>
@@ -300,7 +300,7 @@
           <w:i w:val="0"/>
           <w:sz w:val="24"/>
         </w:rPr>
-        <w:t>Work bottom-up, one module at a time.</w:t>
+        <w:t>Translate in phases, like a compiler.</w:t>
       </w:r>
       <w:r>
         <w:rPr>
@@ -309,7 +309,7 @@
           <w:i w:val="0"/>
           <w:sz w:val="24"/>
         </w:rPr>
-        <w:t xml:space="preserve"> Translate the helper functions first, port their tests to JUnit, and only then translate the code that uses them, so every bug stays inside the newest module.</w:t>
+        <w:t xml:space="preserve"> A compiler checks tokens, then grammar, then meaning (Bhumika, 2022; Neso Academy, 2022). I would first translate the syntax (indentation becomes braces, def becomes a typed method), then make a separate semantic pass over every type, division, and comparison.</w:t>
       </w:r>
     </w:p>
     <w:p>
@@ -325,6 +325,39 @@
           <w:sz w:val="24"/>
         </w:rPr>
         <w:t xml:space="preserve">5. </w:t>
+      </w:r>
+      <w:r>
+        <w:rPr>
+          <w:rFonts w:ascii="Times New Roman" w:hAnsi="Times New Roman"/>
+          <w:b/>
+          <w:i w:val="0"/>
+          <w:sz w:val="24"/>
+        </w:rPr>
+        <w:t>Work bottom-up and switch over gradually.</w:t>
+      </w:r>
+      <w:r>
+        <w:rPr>
+          <w:rFonts w:ascii="Times New Roman" w:hAnsi="Times New Roman"/>
+          <w:b w:val="0"/>
+          <w:i w:val="0"/>
+          <w:sz w:val="24"/>
+        </w:rPr>
+        <w:t xml:space="preserve"> Translate the helper functions first, port their tests to JUnit, and let an automated build run both test suites on every change. The Python program stays in use until the Java version matches every golden result, so users never notice the switch.</w:t>
+      </w:r>
+    </w:p>
+    <w:p>
+      <w:pPr>
+        <w:spacing w:line="360" w:lineRule="auto" w:after="0"/>
+        <w:ind w:left="720" w:hanging="360"/>
+      </w:pPr>
+      <w:r>
+        <w:rPr>
+          <w:rFonts w:ascii="Times New Roman" w:hAnsi="Times New Roman"/>
+          <w:b w:val="0"/>
+          <w:i w:val="0"/>
+          <w:sz w:val="24"/>
+        </w:rPr>
+        <w:t xml:space="preserve">6. </w:t>
       </w:r>
       <w:r>
         <w:rPr>
@@ -404,7 +437,7 @@
           <w:i w:val="0"/>
           <w:sz w:val="24"/>
         </w:rPr>
-        <w:t xml:space="preserve"> -7 // 2 is -4 in Python, because Python always rounds toward minus infinity (Python Software Foundation, n.d.). In Java, -7 / 2 is -3, because integer division rounds toward zero (Gosling et al., 2023). A grade calculator that handles negative adjustments would quietly give different results. Java's Math.floorDiv restores Python's behavior.</w:t>
+        <w:t xml:space="preserve"> -7 // 2 is -4 in Python, which always rounds toward minus infinity (Python Software Foundation, n.d.), but -7 / 2 is -3 in Java, which rounds toward zero (Gosling et al., 2023). A grade calculator with negative adjustments would quietly give different results.</w:t>
       </w:r>
     </w:p>
     <w:p>
@@ -446,7 +479,7 @@
           <w:i w:val="0"/>
           <w:sz w:val="24"/>
         </w:rPr>
-        <w:t>31 is simply 2147483648 (Python Software Foundation, n.d.). In Java, Integer.MAX_VALUE + 1 wraps around to -2147483648 with no warning, because Java's integer operators "do not indicate overflow or underflow in any way" (Gosling et al., 2023).</w:t>
+        <w:t>31 is simply 2147483648 (Python Software Foundation, n.d.). In Java, Integer.MAX_VALUE + 1 wraps to -2147483648, because Java's integer operators "do not indicate overflow or underflow in any way" (Gosling et al., 2023).</w:t>
       </w:r>
     </w:p>
     <w:p>
@@ -479,7 +512,7 @@
           <w:i w:val="0"/>
           <w:sz w:val="24"/>
         </w:rPr>
-        <w:t xml:space="preserve"> round(2.5) gives 2 in Python, which rounds halves to the nearest even number, but Math.round(2.5) gives 3 in Java.</w:t>
+        <w:t xml:space="preserve"> Python's round(2.5) gives 2, because it rounds halves to the even number (Python Software Foundation, n.d.), while Java's Math.round(2.5) gives 3.</w:t>
       </w:r>
     </w:p>
     <w:p>
@@ -512,7 +545,7 @@
           <w:i w:val="0"/>
           <w:sz w:val="24"/>
         </w:rPr>
-        <w:t xml:space="preserve"> == compares string values in Python, but in Java it compares object references, so equals() is needed.</w:t>
+        <w:t xml:space="preserve"> == compares string values in Python, but object references in Java, where equals() is needed.</w:t>
       </w:r>
     </w:p>
     <w:p>
@@ -545,7 +578,7 @@
           <w:i w:val="0"/>
           <w:sz w:val="24"/>
         </w:rPr>
-        <w:t xml:space="preserve"> a Python function may return a number on success and None on failure. Java needs one declared return type, so the design itself must change.</w:t>
+        <w:t xml:space="preserve"> a Python function may return a number or None. Java needs one declared return type, so the design itself must change.</w:t>
       </w:r>
     </w:p>
     <w:p>
@@ -559,7 +592,7 @@
           <w:i w:val="0"/>
           <w:sz w:val="24"/>
         </w:rPr>
-        <w:t>The benefits are real, too. Java's static typing moves many errors from run time to compile time, Java programs usually run faster than interpreted Python, and the Java ecosystem suits large, long-lived systems. The process also improves the original code, because writing explicit types exposes hidden assumptions and bugs in the Python version.</w:t>
+        <w:t>The benefits are real, too. Java's static typing moves many errors from run time to compile time, Java programs usually run faster, and the Java ecosystem suits large, long-lived systems. The process also improves the original code, because writing explicit types exposes hidden assumptions and bugs in the Python version.</w:t>
       </w:r>
     </w:p>
     <w:p>
@@ -588,7 +621,7 @@
           <w:i w:val="0"/>
           <w:sz w:val="24"/>
         </w:rPr>
-        <w:t>Some practices are much more prominent in one language. Python favors concise code, dynamic "duck" typing, and readability enforced by indentation, so a script can be written and changed quickly. Java favors explicit types, encapsulation with private fields, interfaces that define contracts, and checked exceptions that force callers to handle errors. Java takes more lines, but its structure helps large teams. This unit also reminded me that every language is eventually translated into the same machine code (BGZDevTips, 2016), so the language choice matters mostly for people, not for the processor.</w:t>
+        <w:t>Some practices are much more prominent in one language. Python favors concise code, dynamic "duck" typing, and readability enforced by indentation, so a script can be written and changed quickly. Java favors explicit types, encapsulation with private fields, interfaces that define contracts, and checked exceptions that force callers to handle errors. Java takes more lines, but its structure helps large teams. This unit also reminded me that both languages must finally be translated into machine code the processor can execute (BGZDevTips, 2016), so the choice of language matters mostly for the people writing and maintaining the code.</w:t>
       </w:r>
     </w:p>
     <w:p>
@@ -602,7 +635,7 @@
           <w:i w:val="0"/>
           <w:sz w:val="24"/>
         </w:rPr>
-        <w:t>For future projects, I would choose Python for prototypes, scripts, and data analysis, where speed of writing matters most, and Java for team projects and long-lived applications, where compile-time checks and clear contracts pay off. When a prototype grows into a product, the staged approach above gives a safe path from one to the other.</w:t>
+        <w:t>For future projects, I would choose Python for prototypes, scripts, and data analysis, where speed of writing matters most, and Java for team projects and long-lived applications, where compile-time checks and clear contracts pay off. When a prototype grows into a product, the staged approach above gives a safe path from one language to the other.</w:t>
       </w:r>
     </w:p>
     <w:p>
@@ -625,7 +658,7 @@
           <w:i w:val="0"/>
           <w:sz w:val="24"/>
         </w:rPr>
-        <w:t xml:space="preserve"> If a transcompiler translated Python into Java automatically, which compiler phase do you think would struggle most with Python's dynamic typing, and how could it decide what Java type to give a variable whose type changes while the program runs?</w:t>
+        <w:t xml:space="preserve"> If a transcompiler translated Python into Java automatically, which compiler phase do you think would struggle most with Python's dynamic typing, and how could it choose a Java type for a variable whose type changes while the program runs?</w:t>
       </w:r>
     </w:p>
     <w:p>
@@ -639,7 +672,7 @@
           <w:i w:val="0"/>
           <w:sz w:val="24"/>
         </w:rPr>
-        <w:t>Word count: 695</w:t>
+        <w:t>Word count: 715</w:t>
       </w:r>
     </w:p>
     <w:p>

</xml_diff>

<commit_message>
CS1105 Unit 7: paraphrase checks, section numbers for quotes, cite every factual claim
Co-Authored-By: Claude Opus 5.5 <noreply@anthropic.com>
</commit_message>
<xml_diff>
--- a/CS1105_Digital_Electronics_Architecture/Unit7_Assembler_Language/Discussion/Unit7_Discussion_Post.docx
+++ b/CS1105_Digital_Electronics_Architecture/Unit7_Assembler_Language/Discussion/Unit7_Discussion_Post.docx
@@ -148,7 +148,7 @@
           <w:i w:val="0"/>
           <w:sz w:val="24"/>
         </w:rPr>
-        <w:t>For this training project, imagine translating a small Python program that reads student marks, calculates averages and grades, and prints a report into an equivalent Java program. A tool that translates between two high-level languages is called a source-to-source compiler or transcompiler (Compiler, 2021). Doing the job by hand shows that the hard part is keeping the meaning the same, not copying the syntax.</w:t>
+        <w:t>For this training project, imagine translating a small Python program that reads student marks, calculates averages and grades, and prints a report into an equivalent Java program. Software that converts code from one high-level language into another is known as a transcompiler (Compiler, 2021). Doing the job by hand shows that the hard part is keeping the meaning the same, not copying the syntax.</w:t>
       </w:r>
     </w:p>
     <w:p>
@@ -243,7 +243,7 @@
           <w:i w:val="0"/>
           <w:sz w:val="24"/>
         </w:rPr>
-        <w:t xml:space="preserve"> The Python code stays in a python folder, the Java code goes in a java folder, and the golden results sit in a shared tests folder, so both versions are checked against exactly the same data.</w:t>
+        <w:t xml:space="preserve"> The Python and Java code sit in separate folders beside a shared tests folder, so both are checked against the same golden results.</w:t>
       </w:r>
     </w:p>
     <w:p>
@@ -375,7 +375,7 @@
           <w:i w:val="0"/>
           <w:sz w:val="24"/>
         </w:rPr>
-        <w:t xml:space="preserve"> Every decision, such as "Python // became Math.floorDiv", is recorded so the team understands why the Java code looks the way it does.</w:t>
+        <w:t xml:space="preserve"> Record every decision, such as "Python // became Math.floorDiv", so the team knows why the Java code looks as it does.</w:t>
       </w:r>
     </w:p>
     <w:p>
@@ -437,7 +437,7 @@
           <w:i w:val="0"/>
           <w:sz w:val="24"/>
         </w:rPr>
-        <w:t xml:space="preserve"> -7 // 2 is -4 in Python, which always rounds toward minus infinity (Python Software Foundation, n.d.), but -7 / 2 is -3 in Java, which rounds toward zero (Gosling et al., 2023). A grade calculator with negative adjustments would quietly give different results.</w:t>
+        <w:t xml:space="preserve"> -7 // 2 is -4 in Python, which always rounds toward minus infinity (Python Software Foundation, n.d.-a), but -7 / 2 is -3 in Java, which rounds toward zero (Gosling et al., 2023, §15.17.2). A grade calculator with negative adjustments would quietly give different results.</w:t>
       </w:r>
     </w:p>
     <w:p>
@@ -479,7 +479,7 @@
           <w:i w:val="0"/>
           <w:sz w:val="24"/>
         </w:rPr>
-        <w:t>31 is simply 2147483648 (Python Software Foundation, n.d.). In Java, Integer.MAX_VALUE + 1 wraps to -2147483648, because Java's integer operators "do not indicate overflow or underflow in any way" (Gosling et al., 2023).</w:t>
+        <w:t>31 is simply 2147483648 (Python Software Foundation, n.d.-a). In Java, Integer.MAX_VALUE + 1 wraps to -2147483648, because Java's integer operators "do not indicate overflow or underflow in any way" (Gosling et al., 2023, §4.2.2).</w:t>
       </w:r>
     </w:p>
     <w:p>
@@ -512,7 +512,7 @@
           <w:i w:val="0"/>
           <w:sz w:val="24"/>
         </w:rPr>
-        <w:t xml:space="preserve"> Python's round(2.5) gives 2, because it rounds halves to the even number (Python Software Foundation, n.d.), while Java's Math.round(2.5) gives 3.</w:t>
+        <w:t xml:space="preserve"> Python's round(2.5) gives 2, because it rounds halves to the even number (Python Software Foundation, n.d.-a), while Java's Math.round(2.5) gives 3.</w:t>
       </w:r>
     </w:p>
     <w:p>
@@ -545,7 +545,7 @@
           <w:i w:val="0"/>
           <w:sz w:val="24"/>
         </w:rPr>
-        <w:t xml:space="preserve"> == compares string values in Python, but object references in Java, where equals() is needed.</w:t>
+        <w:t xml:space="preserve"> == compares string values in Python, but in Java it is true only when both operands refer to the same object (Gosling et al., 2023, §15.21.3), so equals() is needed.</w:t>
       </w:r>
     </w:p>
     <w:p>
@@ -592,7 +592,7 @@
           <w:i w:val="0"/>
           <w:sz w:val="24"/>
         </w:rPr>
-        <w:t>The benefits are real, too. Java's static typing moves many errors from run time to compile time, Java programs usually run faster, and the Java ecosystem suits large, long-lived systems. The process also improves the original code, because writing explicit types exposes hidden assumptions and bugs in the Python version.</w:t>
+        <w:t>The benefits are real, too. Java is statically typed, so every variable's type is known before the program runs and many errors are caught at compile time (Gosling et al., 2023, §4). In my view, Java's tooling also suits large, long-lived systems. The process also improves the original code, because writing explicit types exposes hidden assumptions and bugs in the Python version.</w:t>
       </w:r>
     </w:p>
     <w:p>
@@ -621,7 +621,7 @@
           <w:i w:val="0"/>
           <w:sz w:val="24"/>
         </w:rPr>
-        <w:t>Some practices are much more prominent in one language. Python favors concise code, dynamic "duck" typing, and readability enforced by indentation, so a script can be written and changed quickly. Java favors explicit types, encapsulation with private fields, interfaces that define contracts, and checked exceptions that force callers to handle errors. Java takes more lines, but its structure helps large teams. This unit also reminded me that both languages must finally be translated into machine code the processor can execute (BGZDevTips, 2016), so the choice of language matters mostly for the people writing and maintaining the code.</w:t>
+        <w:t>Some practices are more prominent in one language. Python favors concise code, duck typing, where code simply uses an object's methods instead of checking its type (Python Software Foundation, n.d.-b), and indentation that decides how statements are grouped (Python Software Foundation, n.d.-c). Java favors explicit types, private fields, interfaces that define contracts, and checked exceptions, which the compiler requires every caller to handle (Gosling et al., 2023, §11.2). Java takes more lines, but I think its structure helps large teams. This unit also reminded me that both languages must finally be translated into machine code the processor can execute (BGZDevTips, 2016), so the language choice matters mostly to the people maintaining the code.</w:t>
       </w:r>
     </w:p>
     <w:p>
@@ -635,7 +635,7 @@
           <w:i w:val="0"/>
           <w:sz w:val="24"/>
         </w:rPr>
-        <w:t>For future projects, I would choose Python for prototypes, scripts, and data analysis, where speed of writing matters most, and Java for team projects and long-lived applications, where compile-time checks and clear contracts pay off. When a prototype grows into a product, the staged approach above gives a safe path from one language to the other.</w:t>
+        <w:t>For future projects, I would choose Python for prototypes, scripts, and data analysis, where speed of writing matters most, and Java for team projects and long-lived applications, where compile-time checks and clear contracts pay off. If a prototype grows into a product, the staged plan above offers a safe path to Java.</w:t>
       </w:r>
     </w:p>
     <w:p>
@@ -672,7 +672,7 @@
           <w:i w:val="0"/>
           <w:sz w:val="24"/>
         </w:rPr>
-        <w:t>Word count: 715</w:t>
+        <w:t>Word count: 741</w:t>
       </w:r>
     </w:p>
     <w:p>
@@ -927,7 +927,7 @@
           <w:i w:val="0"/>
           <w:sz w:val="24"/>
         </w:rPr>
-        <w:t xml:space="preserve">Python Software Foundation. (n.d.). Built-in types. In </w:t>
+        <w:t xml:space="preserve">Python Software Foundation. (n.d.-a). Built-in types. In </w:t>
       </w:r>
       <w:r>
         <w:rPr>
@@ -956,6 +956,94 @@
             <w:sz w:val="24"/>
           </w:rPr>
           <w:t>https://docs.python.org/3/library/stdtypes.html</w:t>
+        </w:r>
+      </w:hyperlink>
+    </w:p>
+    <w:p>
+      <w:pPr>
+        <w:spacing w:line="360" w:lineRule="auto" w:after="0"/>
+        <w:ind w:left="720" w:hanging="720"/>
+      </w:pPr>
+      <w:r>
+        <w:rPr>
+          <w:rFonts w:ascii="Times New Roman" w:hAnsi="Times New Roman"/>
+          <w:b w:val="0"/>
+          <w:i w:val="0"/>
+          <w:sz w:val="24"/>
+        </w:rPr>
+        <w:t xml:space="preserve">Python Software Foundation. (n.d.-b). Glossary. In </w:t>
+      </w:r>
+      <w:r>
+        <w:rPr>
+          <w:rFonts w:ascii="Times New Roman" w:hAnsi="Times New Roman"/>
+          <w:b w:val="0"/>
+          <w:i/>
+          <w:sz w:val="24"/>
+        </w:rPr>
+        <w:t>Python documentation</w:t>
+      </w:r>
+      <w:r>
+        <w:rPr>
+          <w:rFonts w:ascii="Times New Roman" w:hAnsi="Times New Roman"/>
+          <w:b w:val="0"/>
+          <w:i w:val="0"/>
+          <w:sz w:val="24"/>
+        </w:rPr>
+        <w:t xml:space="preserve">. </w:t>
+      </w:r>
+      <w:hyperlink r:id="rId16">
+        <w:r>
+          <w:rPr>
+            <w:rFonts w:ascii="Times New Roman" w:hAnsi="Times New Roman"/>
+            <w:color w:val="0563C1"/>
+            <w:u w:val="single"/>
+            <w:sz w:val="24"/>
+          </w:rPr>
+          <w:t>https://docs.python.org/3/glossary.html</w:t>
+        </w:r>
+      </w:hyperlink>
+    </w:p>
+    <w:p>
+      <w:pPr>
+        <w:spacing w:line="360" w:lineRule="auto" w:after="0"/>
+        <w:ind w:left="720" w:hanging="720"/>
+      </w:pPr>
+      <w:r>
+        <w:rPr>
+          <w:rFonts w:ascii="Times New Roman" w:hAnsi="Times New Roman"/>
+          <w:b w:val="0"/>
+          <w:i w:val="0"/>
+          <w:sz w:val="24"/>
+        </w:rPr>
+        <w:t xml:space="preserve">Python Software Foundation. (n.d.-c). Lexical analysis. In </w:t>
+      </w:r>
+      <w:r>
+        <w:rPr>
+          <w:rFonts w:ascii="Times New Roman" w:hAnsi="Times New Roman"/>
+          <w:b w:val="0"/>
+          <w:i/>
+          <w:sz w:val="24"/>
+        </w:rPr>
+        <w:t>The Python language reference</w:t>
+      </w:r>
+      <w:r>
+        <w:rPr>
+          <w:rFonts w:ascii="Times New Roman" w:hAnsi="Times New Roman"/>
+          <w:b w:val="0"/>
+          <w:i w:val="0"/>
+          <w:sz w:val="24"/>
+        </w:rPr>
+        <w:t xml:space="preserve">. </w:t>
+      </w:r>
+      <w:hyperlink r:id="rId17">
+        <w:r>
+          <w:rPr>
+            <w:rFonts w:ascii="Times New Roman" w:hAnsi="Times New Roman"/>
+            <w:color w:val="0563C1"/>
+            <w:u w:val="single"/>
+            <w:sz w:val="24"/>
+          </w:rPr>
+          <w:t>https://docs.python.org/3/reference/lexical_analysis.html</w:t>
         </w:r>
       </w:hyperlink>
     </w:p>

</xml_diff>